<commit_message>
Roadmap capture: add P-3, D-3, F-3 from C1 Evidence-to-Judgment Routing design
</commit_message>
<xml_diff>
--- a/docs/HEOS_Evidence_Engine_Product_Development_Roadmap_WORKING_ACCUMULATING.docx
+++ b/docs/HEOS_Evidence_Engine_Product_Development_Roadmap_WORKING_ACCUMULATING.docx
@@ -593,6 +593,30 @@
     </w:p>
     <w:p>
       <w:pPr>
+        <w:spacing w:after="160"/>
+      </w:pPr>
+      <w:r>
+        <w:rPr>
+          <w:b/>
+          <w:bCs/>
+        </w:rPr>
+        <w:t xml:space="preserve">P-3  </w:t>
+      </w:r>
+      <w:r>
+        <w:t xml:space="preserve">Evidence-to-Judgment Routing — V1 C1 demonstrates a bounded routing pattern in which already-established Evidence Engine result classifications are routed to different human-review outcomes without allowing the automation to reinterpret the evidence or make the decision itself. A future organizational pilot could extend this pattern into governed human-review workflows that route different evidence/result types to appropriate organizational roles while preserving human responsibility for interpretation and action.</w:t>
+      </w:r>
+      <w:r>
+        <w:rPr>
+          <w:i/>
+          <w:iCs/>
+          <w:sz w:val="19"/>
+          <w:szCs w:val="19"/>
+        </w:rPr>
+        <w:t xml:space="preserve">  (Source: Workstream C1 Evidence-to-Judgment Routing design decision and implementation planning)</w:t>
+      </w:r>
+    </w:p>
+    <w:p>
+      <w:pPr>
         <w:pStyle w:val="Heading1"/>
         <w:spacing w:after="180" w:before="360"/>
       </w:pPr>
@@ -650,6 +674,30 @@
     </w:p>
     <w:p>
       <w:pPr>
+        <w:spacing w:after="160"/>
+      </w:pPr>
+      <w:r>
+        <w:rPr>
+          <w:b/>
+          <w:bCs/>
+        </w:rPr>
+        <w:t xml:space="preserve">D-3  </w:t>
+      </w:r>
+      <w:r>
+        <w:t xml:space="preserve">How should users interact with the Evidence Engine inside a real healthcare organization, both to provide or authorize access to evidence and to review results requiring human judgment? Potential interaction patterns could include manual evidence upload during an early pilot, direct source-system integration, or delivery through an existing organizational interface. The appropriate model cannot be determined without organizational discovery.</w:t>
+      </w:r>
+      <w:r>
+        <w:rPr>
+          <w:i/>
+          <w:iCs/>
+          <w:sz w:val="19"/>
+          <w:szCs w:val="19"/>
+        </w:rPr>
+        <w:t xml:space="preserve">  (Source: Workstream C1 architecture discussion prompted by the question of how an eventual user would actually interact with HEOS)</w:t>
+      </w:r>
+    </w:p>
+    <w:p>
+      <w:pPr>
         <w:pStyle w:val="Heading1"/>
         <w:spacing w:after="180" w:before="360"/>
       </w:pPr>
@@ -716,6 +764,30 @@
           <w:szCs w:val="19"/>
         </w:rPr>
         <w:t xml:space="preserve">  (Source: Inferred directly from the synthetic-data boundary already established in Roadmap Rev. 17 and the Whitepaper; not yet a specified requirement)</w:t>
+      </w:r>
+    </w:p>
+    <w:p>
+      <w:pPr>
+        <w:spacing w:after="160"/>
+      </w:pPr>
+      <w:r>
+        <w:rPr>
+          <w:b/>
+          <w:bCs/>
+        </w:rPr>
+        <w:t xml:space="preserve">F-3  </w:t>
+      </w:r>
+      <w:r>
+        <w:t xml:space="preserve">A more mature Evidence Engine could potentially obtain evidence from organizational source systems rather than depending on manual file placement or upload. Any such capability would depend on the organization's actual data architecture, access permissions, security and privacy requirements, governance, and operating workflow.</w:t>
+      </w:r>
+      <w:r>
+        <w:rPr>
+          <w:i/>
+          <w:iCs/>
+          <w:sz w:val="19"/>
+          <w:szCs w:val="19"/>
+        </w:rPr>
+        <w:t xml:space="preserve">  (Source: Workstream C1 architecture discussion; extension of the existing real-organization discovery questions and synthetic-data boundary)</w:t>
       </w:r>
     </w:p>
     <w:p>

</xml_diff>